<commit_message>
Publish reproducible research archive with redacted source snapshot
</commit_message>
<xml_diff>
--- a/paper/submission/full_paper.docx
+++ b/paper/submission/full_paper.docx
@@ -2424,7 +2424,7 @@
     <w:p>
       <w:pPr/>
       <w:r>
-        <w:t>External and reproducibility validity. The historical model tag and prompt are recorded, but exact Ollama binary and model weights digests were not frozen in the main manifest; the later pilot records a weights digest and runtime version. The synthetic, short Python fixtures differ from mature cryptographic libraries and real web services. The pilot's stateless finite modes exclude memoryful or arbitrary programs, and independent human review of its task semantics is pending. Raw traces are kept in a local archive excluded from Git; an external researcher needs that archive, or a carefully reviewed redacted release, to reproduce every numerical result. Saved SHA 256 receipts and current code validate consistency and version linkage, not secure append only storage or a full third party reproduction. Historical engineering smokes and containment simulations have different protocols and remain outside the main estimates.</w:t>
+        <w:t>External and reproducibility validity. The historical model tag and prompt are recorded, but exact Ollama binary and model weights digests were not frozen in the main manifest; the later pilot records a weights digest and runtime version. The synthetic, short Python fixtures differ from mature cryptographic libraries and real web services. The pilot's stateless finite modes exclude memoryful or arbitrary programs, and independent human review of its task semantics is pending. The current research branch tracks the raw trajectories and archives needed to recalculate the reported counts; a reader must use a revision containing those files, because the default branch may lag this draft. Saved SHA 256 receipts and current code validate consistency and version linkage, not secure append only storage or a full third party reproduction. Historical engineering smokes and containment simulations have different protocols and remain outside the main estimates.</w:t>
       </w:r>
     </w:p>
     <w:p>
@@ -2444,7 +2444,7 @@
     <w:p>
       <w:pPr/>
       <w:r>
-        <w:t>Publication of full trajectories may expose model generated code, local path metadata, and tool output; raw release should be reviewed and redacted without breaking the source/verifier linkage. The present local archive remains necessary to reproduce the counts. We know of no human participants in these episodes. Ethics approval or data release permission is not asserted because no such approval record was found in the reviewed repository.</w:t>
+        <w:t>The tracked full trajectories include model generated code, local path metadata, and tool output. Their presence in the research branch does not establish suitability as a journal supplement or a privacy-reviewed dataset; any transformed supplement must preserve the source/verifier linkage. The saved archives remain necessary to reproduce the counts. We know of no human participants in these episodes. Ethics approval or journal data-release clearance is not asserted because no such approval record was found in the reviewed repository.</w:t>
       </w:r>
     </w:p>
     <w:p>
@@ -2472,7 +2472,7 @@
     <w:p>
       <w:pPr/>
       <w:r>
-        <w:t>From the repository root, run python3 -B -m analysis.paper_pipeline --output paper/artifacts; this reads the saved historical main and AEAD pilot trajectories and verifies their hashes without launching Docker or the model. Separately run python3 -B -m analysis.audit_v7_decisive_excluded_pilot --check and python3 -B -m analysis.audit_v7_decisive_c5_fork --check to recheck the corrected-oracle pilot and matched continuation. Those commands require the Git-ignored local v7 archives; the tracked derived audit JSON files alone do not reproduce their counts. Rebuild the figures and submission documents with sh reproduction/render_paper.sh using the bundled workspace Python dependencies described in paper/README.md. A researcher without experiments/runs/ and experiments/raw_archive/ can inspect the manuscript and derived tables but cannot independently regenerate all counts. The original study source commit is 98a4dcf414672c1725e4acdb9f08045370aa7f64; this manuscript and post-collection analysis remain a working-tree review draft pending a final release revision.</w:t>
+        <w:t>From the repository root, run python3 -B -m analysis.paper_pipeline --output paper/artifacts; this reads the saved historical main and AEAD pilot trajectories and verifies their hashes without launching Docker or the model. Separately run python3 -B -m analysis.audit_v7_decisive_excluded_pilot --check and python3 -B -m analysis.audit_v7_decisive_c5_fork --check to recheck the corrected-oracle pilot and matched continuation. Those commands require the v7 archives tracked on the current research branch; the derived audit JSON files alone do not reproduce their counts. Rebuild the figures and submission documents with sh reproduction/render_paper.sh using the bundled workspace Python dependencies described in paper/README.md. A checkout lacking experiments/runs/ or experiments/raw_archive/ can inspect the manuscript and derived tables but cannot independently regenerate all counts. The original study source commit is 98a4dcf414672c1725e4acdb9f08045370aa7f64; this manuscript and post-collection analysis remain an author-review draft pending a final source revision and journal data-availability statement.</w:t>
       </w:r>
     </w:p>
     <w:p>

</xml_diff>

<commit_message>
Publish reproducible research archive with redacted source snapshot (#2)
</commit_message>
<xml_diff>
--- a/paper/submission/full_paper.docx
+++ b/paper/submission/full_paper.docx
@@ -2424,7 +2424,7 @@
     <w:p>
       <w:pPr/>
       <w:r>
-        <w:t>External and reproducibility validity. The historical model tag and prompt are recorded, but exact Ollama binary and model weights digests were not frozen in the main manifest; the later pilot records a weights digest and runtime version. The synthetic, short Python fixtures differ from mature cryptographic libraries and real web services. The pilot's stateless finite modes exclude memoryful or arbitrary programs, and independent human review of its task semantics is pending. Raw traces are kept in a local archive excluded from Git; an external researcher needs that archive, or a carefully reviewed redacted release, to reproduce every numerical result. Saved SHA 256 receipts and current code validate consistency and version linkage, not secure append only storage or a full third party reproduction. Historical engineering smokes and containment simulations have different protocols and remain outside the main estimates.</w:t>
+        <w:t>External and reproducibility validity. The historical model tag and prompt are recorded, but exact Ollama binary and model weights digests were not frozen in the main manifest; the later pilot records a weights digest and runtime version. The synthetic, short Python fixtures differ from mature cryptographic libraries and real web services. The pilot's stateless finite modes exclude memoryful or arbitrary programs, and independent human review of its task semantics is pending. The current research branch tracks the raw trajectories and archives needed to recalculate the reported counts; a reader must use a revision containing those files, because the default branch may lag this draft. Saved SHA 256 receipts and current code validate consistency and version linkage, not secure append only storage or a full third party reproduction. Historical engineering smokes and containment simulations have different protocols and remain outside the main estimates.</w:t>
       </w:r>
     </w:p>
     <w:p>
@@ -2444,7 +2444,7 @@
     <w:p>
       <w:pPr/>
       <w:r>
-        <w:t>Publication of full trajectories may expose model generated code, local path metadata, and tool output; raw release should be reviewed and redacted without breaking the source/verifier linkage. The present local archive remains necessary to reproduce the counts. We know of no human participants in these episodes. Ethics approval or data release permission is not asserted because no such approval record was found in the reviewed repository.</w:t>
+        <w:t>The tracked full trajectories include model generated code, local path metadata, and tool output. Their presence in the research branch does not establish suitability as a journal supplement or a privacy-reviewed dataset; any transformed supplement must preserve the source/verifier linkage. The saved archives remain necessary to reproduce the counts. We know of no human participants in these episodes. Ethics approval or journal data-release clearance is not asserted because no such approval record was found in the reviewed repository.</w:t>
       </w:r>
     </w:p>
     <w:p>
@@ -2472,7 +2472,7 @@
     <w:p>
       <w:pPr/>
       <w:r>
-        <w:t>From the repository root, run python3 -B -m analysis.paper_pipeline --output paper/artifacts; this reads the saved historical main and AEAD pilot trajectories and verifies their hashes without launching Docker or the model. Separately run python3 -B -m analysis.audit_v7_decisive_excluded_pilot --check and python3 -B -m analysis.audit_v7_decisive_c5_fork --check to recheck the corrected-oracle pilot and matched continuation. Those commands require the Git-ignored local v7 archives; the tracked derived audit JSON files alone do not reproduce their counts. Rebuild the figures and submission documents with sh reproduction/render_paper.sh using the bundled workspace Python dependencies described in paper/README.md. A researcher without experiments/runs/ and experiments/raw_archive/ can inspect the manuscript and derived tables but cannot independently regenerate all counts. The original study source commit is 98a4dcf414672c1725e4acdb9f08045370aa7f64; this manuscript and post-collection analysis remain a working-tree review draft pending a final release revision.</w:t>
+        <w:t>From the repository root, run python3 -B -m analysis.paper_pipeline --output paper/artifacts; this reads the saved historical main and AEAD pilot trajectories and verifies their hashes without launching Docker or the model. Separately run python3 -B -m analysis.audit_v7_decisive_excluded_pilot --check and python3 -B -m analysis.audit_v7_decisive_c5_fork --check to recheck the corrected-oracle pilot and matched continuation. Those commands require the v7 archives tracked on the current research branch; the derived audit JSON files alone do not reproduce their counts. Rebuild the figures and submission documents with sh reproduction/render_paper.sh using the bundled workspace Python dependencies described in paper/README.md. A checkout lacking experiments/runs/ or experiments/raw_archive/ can inspect the manuscript and derived tables but cannot independently regenerate all counts. The original study source commit is 98a4dcf414672c1725e4acdb9f08045370aa7f64; this manuscript and post-collection analysis remain an author-review draft pending a final source revision and journal data-availability statement.</w:t>
       </w:r>
     </w:p>
     <w:p>

</xml_diff>

<commit_message>
Correct manuscript stopping and source fidelity claims
</commit_message>
<xml_diff>
--- a/paper/submission/full_paper.docx
+++ b/paper/submission/full_paper.docx
@@ -111,7 +111,7 @@
     <w:p>
       <w:pPr/>
       <w:r>
-        <w:t>Security repair work moves that feedback loop into a domain where passing a tool check is a particularly consequential claim. Sriram et al. combine retrieved prior repairs with GCC, CodeQL, and KLEE in iterative secure generation [1]; Kulsum et al. study reasoning prompts and patch validation feedback for vulnerability repair [7]. They motivate separate accounting of checker receipts, but their datasets, models, and security tools are not interchangeable with these local fixtures. Our distinct measurement target is the behavior between checks, together with the validity of the check itself. We vary feedback wording and a fixed family guidance document, not the quality of open-ended retrieval. Original retrieval augmented generation selects external evidence for generation [14], whereas our lookup returns at most one predetermined document; calling this an RAG effect would overstate the manipulation.</w:t>
+        <w:t>Security repair work moves that feedback loop into a domain where passing a tool check is a particularly consequential claim. Sriram et al. combine retrieved prior repairs with GCC, CodeQL, and KLEE in iterative secure generation [1]; Kulsum et al. study reasoning prompts and patch validation feedback for vulnerability repair [7]. They motivate separate accounting of checker receipts, but their datasets, models, and security tools are not interchangeable with these local fixtures. Our distinct measurement target is the behavior between checks, together with the validity of the check itself. Our historical factor is static contextual guidance: one predetermined document was selected by task family before the episode and appended to the task prompt. There was no ranking, error-text query, or search. Retrieval augmented generation is a different intervention [14].</w:t>
       </w:r>
     </w:p>
     <w:p>
@@ -189,7 +189,7 @@
     <w:p>
       <w:pPr/>
       <w:r>
-        <w:t>The earlier protocol proposed six falsifiable hypotheses and a family clustered GEE analysis (see docs/preregistration.md). It envisioned 20 families, three repeated runs per arm, independent strategy annotation, and a valid unavailable condition. The historical dataset contains five main families, one run per arm, no blinded strategy coding, and a checker rule that changes the meaning of unavailability. We therefore treat all historical results as exploratory and leave the planned hypothesis tests unresolved. The later two-family pilot does not fill those missing main cells. The protocol document is a local, versioned plan; its external registration date has not been independently established.</w:t>
+        <w:t>The earlier protocol proposed six falsifiable hypotheses and a family-level statistical analysis (see docs/preregistration.md). It envisioned 20 families, three repeated runs per arm, independent strategy annotation, and a valid unavailable condition. The historical dataset contains five main families, one run per arm, no blinded strategy coding, and a checker rule that changes the meaning of unavailability. We therefore treat all historical results as exploratory and leave the planned hypothesis tests unresolved. The later two-family pilot does not fill those missing main cells. The protocol document is a local, versioned plan; its external registration date has not been independently established.</w:t>
       </w:r>
     </w:p>
     <w:p>
@@ -223,7 +223,7 @@
     <w:p>
       <w:pPr/>
       <w:r>
-        <w:t>The agent saw a local task card, its starting code, bounded tools, public checker feedback, and, in guidance on episodes, a family specific document. It did not receive the hidden condition label or acceptance rule through the task interface. The guidance corpus contained 20 reviewed documents, was selected deterministically by family, and had SHA 256 3d1a662cf4e40208d95a0d30aae0cfc00aa07544e942c117ba66921e4e77461f. This is a controlled prompt addition. It is not an experiment on retrieval ranking, search quality, or growing memory.</w:t>
+        <w:t>The agent saw a local task card, its starting code, bounded tools, public checker feedback, and, in guidance on episodes, a family specific document. It did not receive the hidden condition label or acceptance rule through the task interface. The static contextual guidance corpus contained 20 reviewed documents, was selected deterministically by family before the episode, and had SHA 256 3d1a662cf4e40208d95a0d30aae0cfc00aa07544e942c117ba66921e4e77461f. This controlled prompt addition did not search by checker error or evaluate retrieval quality.</w:t>
       </w:r>
     </w:p>
     <w:p>
@@ -249,7 +249,7 @@
     <w:p>
       <w:pPr/>
       <w:r>
-        <w:t>The main manifest specified at most six tool steps and 1800 seconds per episode; the task card imposed a stricter effective 900 second episode boundary, and the provider request timeout was 600 seconds. A request already in flight could finish after the nominal boundary. Our analysis uses the effective 900 second limit recorded per run and keeps timeout as a behavioral event. It does not assume a clean 30 minute limit. The trajectories contain action, parameters, observation, checker receipt, elapsed time, stop event, and terminal response. Only observable data are analyzed; the analysis never extracts model reasoning.</w:t>
+        <w:t>The main manifest specified at most six tool steps and 1800 seconds per episode; the task card imposed a stricter nominal 900 second boundary, and the adapter configured a 600 second timeout for each provider request. The runner checked the episode deadline before a blocking model call, not while that call was in flight. A call started before 900 seconds could therefore return after 900 seconds without exceeding its own configured request timeout. We use the recorded 900 second limit to identify deadline overruns and treat terminal labels as runner events, not unambiguous evidence of an agent's decision to stop. The trajectories contain action, parameters, observation, checker receipt, elapsed time, stop event, and terminal response. Only observable data are analyzed; the analysis never extracts model reasoning.</w:t>
       </w:r>
     </w:p>
     <w:p>
@@ -477,7 +477,7 @@
     <w:p>
       <w:pPr/>
       <w:r>
-        <w:t>Stopping follows the recorded terminal reason: agent self termination, budget stop, timeout, or infrastructure abort. Self termination is not automatically rational; the adapter may reach it after exhausting protocol reminders without an explicit claim. Evidence based abandonment would require an independently established impossibility condition and a trace showing that the agent recognized it. Those criteria are not met here.</w:t>
+        <w:t>Stopping is described using the recorded terminal reason: agent self termination, budget stop, timeout, or infrastructure abort. These are runner labels. A self termination label can follow protocol reminders or a deadline overrun; a timeout label can follow an agent-authored terminate call that arrived after the nominal boundary. Evidence based abandonment would require an independently established impossibility condition and a trace showing that the agent recognized it. Those criteria are not met here.</w:t>
       </w:r>
     </w:p>
     <w:p>
@@ -503,7 +503,7 @@
     <w:p>
       <w:pPr/>
       <w:r>
-        <w:t>Across the local historical inventory, 101 receipt files were found: 40 main, eight current pilot, 11 superseded pilot, 25 engineering smokes, one engineering fixture, three containment development smokes, and 13 separate containment simulator attempts. Only the 40 main runs enter the main results. The earlier records differ in protocol and integrity; 87 of the 101 pass the current artifact validator. This denominator is an accounting check, not an exclusion rate for the main study. The containment simulator had no real host access and is outside the security code repair analysis.</w:t>
+        <w:t>Across the local historical inventory, 101 receipt files were found: 40 main, eight historical AEAD pilot, 11 superseded pilot, 25 engineering smokes, one engineering fixture, three containment development smokes, and 13 separate containment simulator attempts. Only the 40 main runs enter the main results. The earlier records differ in protocol and integrity; 87 of the 101 pass the current artifact validator. This denominator is an accounting check, not an exclusion rate for the main study. The containment simulator had no real host access and is outside the security code repair analysis.</w:t>
       </w:r>
     </w:p>
     <w:p>
@@ -523,7 +523,7 @@
     <w:p>
       <w:pPr/>
       <w:r>
-        <w:t>Descriptive rates use exact counts and denominators. For four selected contrasts, we computed a percentile bootstrap over the five families with 20,000 resamples and a fixed analysis seed. These intervals illustrate instability within the selected families; they are not confirmatory population confidence intervals. We report no p values, no multiple comparison adjusted claims, and no GEE: five clusters and the absent independently coded strategy outcome make the prespecified model unsuitable. We purposively inspected five public action sequences for qualitative examples; no blinded dual coder assessment or agreement estimate was performed.</w:t>
+        <w:t>Descriptive rates use exact counts and denominators. For guidance we also report the range of the five leave-one-family-out point contrasts as a sensitivity description. Five selected families with one run per arm do not support the planned population-level hypothesis tests. We report no p values or multiple-comparison-adjusted claims. We purposively inspected five public action sequences for qualitative examples; no blinded dual coder assessment or agreement estimate was performed.</w:t>
       </w:r>
     </w:p>
     <w:p>
@@ -535,7 +535,7 @@
     <w:p>
       <w:pPr/>
       <w:r>
-        <w:t>A separate source-fidelity replay inspected all 77 historical logged source strings against the immutable receipt inventory. It distinguishes Python syntax failure from logger-induced corruption and never reconstructs original code by inserting guessed quotes. A proposed source-change codebook distinguishes surface or parameter edits, similar API substitutions, security-mechanism changes, irrelevant fixes, other visible edits, and unassessable pairs; direction and confidence are separate fields. The five examples below illustrate this taxonomy, but no blinded human coding or inter-rater agreement has been completed.</w:t>
+        <w:t>A separate source-fidelity replay inspected all 77 historical logged source strings against the immutable receipt inventory. It distinguishes Python syntax failure from logger-induced corruption. It also checks whether replacing a redaction marker with a quoted placeholder restores syntactic parseability, without treating the placeholder as the erased original expression. A proposed source-change codebook distinguishes surface or parameter edits, similar API substitutions, security-mechanism changes, irrelevant fixes, other visible edits, and unassessable pairs; direction and confidence are separate fields. The five examples below illustrate this taxonomy, but no blinded human coding or inter-rater agreement has been completed.</w:t>
       </w:r>
     </w:p>
     <w:p>
@@ -1359,7 +1359,7 @@
     <w:p>
       <w:pPr/>
       <w:r>
-        <w:t>The guidance on minus off acceptance difference is −20 percentage points. The diagnostic minus weak difference is also −20 points. Both paired family bootstrap sensitivity intervals span −40 to 0 points. Leaving out one family at a time moves the guidance contrast between −12.5 and −25 points. This does not establish a negative effect: five families, one run per arm, a ceiling on easy families, schedule blocks, and limited checker validity make the contrast unstable. Key derivation and SQL injection account for the two family level guidance differences; the other three main families had no guidance contrast in these cells. No factorial interaction or power based hypothesis test is reported. Figure 1 shows the individual family counts so the marginal contrast is not mistaken for 20 independent families.</w:t>
+        <w:t>The guidance on minus off acceptance difference is −20 percentage points. The diagnostic minus weak difference is also −20 points. Leaving out one family at a time moves the guidance contrast between −12.5 and −25 points. This does not establish a negative effect: five families, one run per arm, a ceiling on easy families, schedule blocks, and limited checker validity make the contrast unstable. Key derivation and SQL injection account for the two family level guidance differences; the other three main families had no guidance contrast in these cells. No factorial interaction or power based hypothesis test is reported. Figure 1 shows the individual family counts so the marginal contrast is not mistaken for 20 independent families.</w:t>
       </w:r>
     </w:p>
     <w:p>
@@ -1427,7 +1427,7 @@
     <w:p>
       <w:pPr/>
       <w:r>
-        <w:t>There were 37 within episode adjacent source pairs. None were exact byte repeats in the logged strings. Fourteen of 77 logged sources were unparseable: the logger replaced credential-like assignments with an unquoted &lt;REDACTED&gt; token in 11; two other sources contain malformed ;def syntax, and one has an unmatched brace. The original ASTs of the 11 redacted submissions cannot be recovered from the preserved logs by adding quotes around the marker. This leaves only 25 adjacent pairs with two parseable sources. Of these 25, zero had identical normalized syntax trees and 17 changed the set of called APIs. An API change can be a move from one secure randomness API to another or a move from a query check to HTML escaping in a SQL injection task; it is not automatically a valid security strategy switch. Two final logged source hashes also differed from the source hashes executed by the evaluator; both contain a redaction marker. These log fidelity failures limit exact code replay and structural coverage. We do not compute a genuine strategy switch rate or semantic repetition rate from this dataset. Figures 2 and 3 retain the denominators.</w:t>
+        <w:t>There were 37 within episode adjacent source pairs. None were exact byte repeats in the logged strings. Fourteen of 77 logged sources were unparseable as saved: the logger replaced the right-hand side of credential-like assignments with an unquoted &lt;REDACTED&gt; token in 11; two other sources contain malformed ;def syntax, and one has an unmatched brace. Replacing &lt;REDACTED&gt; with "&lt;REDACTED&gt;" makes all 11 marked strings parse. Those ASTs describe substituted placeholder code: the original right-hand-side expressions were erased by the logger and cannot be inferred from the marker alone. Only 25 adjacent pairs have two parseable as-logged sources; of these, zero had identical normalized syntax trees and 17 changed the set of called APIs. An API change can be a move from one secure randomness API to another or a move from a query check to HTML escaping in a SQL injection task; it is not automatically a valid security strategy switch. Two final logged source hashes also differed from the source hashes executed by the evaluator; both contain a redaction marker. These log fidelity failures limit exact code replay and structural coverage. We do not compute a genuine strategy switch rate or semantic repetition rate from this dataset. Figures 2 and 3 retain the denominators.</w:t>
       </w:r>
     </w:p>
     <w:p>
@@ -1537,7 +1537,7 @@
     <w:p>
       <w:pPr/>
       <w:r>
-        <w:t>The main stop log contains 38 AGENT_SELF_TERMINATION, one BUDGET_STOP, and one TIMEOUT. The median elapsed time is 647.4 seconds per main episode (range of actions: two to six). The R median is 431.9 seconds and the U median is 728.2 seconds; the different failure exposure and artificial U veto make this a descriptive time contrast. A self termination label includes responses following protocol nudges and is not a measure of evidence based abandonment. The single budget stop occurred in a U episode; the single timeout in an R episode. Figure 4 shows the stop composition.</w:t>
+        <w:t>The main stop log contains 38 AGENT_SELF_TERMINATION, one BUDGET_STOP, and one TIMEOUT. Four of 40 episodes crossed the nominal 900 second boundary before the logged stop: three carry a self-termination label, and the fourth (slot 22) carries TIMEOUT although an agent-authored terminate call appears at about 909.5 seconds. The runner recorded that timeout at about 911.7 seconds. Thus the labels summarize runtime bookkeeping, not a clean contrast between voluntary stopping and forced interruption. The median elapsed time is 647.4 seconds per main episode (range of actions: two to six). The R median is 431.9 seconds and the U median is 728.2 seconds; the different failure exposure and artificial U veto make this a descriptive time contrast. The single budget stop occurred in a U episode; the single timeout in an R episode. Figure 4 shows the recorded labels.</w:t>
       </w:r>
     </w:p>
     <w:p>
@@ -1585,7 +1585,7 @@
           <w:i/>
           <w:sz w:val="24"/>
         </w:rPr>
-        <w:t>Figure 4. Terminal event classification by nominal repairability, n=20 per group. Counts are recorded event types and do not encode rational stopping.</w:t>
+        <w:t>Figure 4. Runner-recorded terminal labels by nominal repairability, n=20 per group. Four episodes crossed the nominal 900-second boundary, including one TIMEOUT label after an agent-authored terminate call; these labels do not establish voluntary or rational stopping.</w:t>
       </w:r>
     </w:p>
     <w:p>
@@ -2264,7 +2264,7 @@
     <w:p>
       <w:pPr/>
       <w:r>
-        <w:t>The C3 and C4 matched seed blocks each produced two submissions: C4 minus C3 was zero submissions in all six blocks, and neither condition produced an early voluntary stop. Two C4 runs voluntarily stopped only at the final permitted decision, after using the same number of submissions as their C3 matches. Thus the truthful contradiction did not shorten the search on either predeclared measure in this pilot. The three repetitions also gave zero within-cell sample SD for submission count in every family-condition cell. That does not establish determinism or yield a meaningful task-population confidence interval; the independent family count remains two.</w:t>
+        <w:t>The C3 and C4 matched seed blocks each produced two submissions: C4 minus C3 was zero submissions in all six blocks, and neither condition produced an early voluntary stop. Two C4 runs voluntarily stopped only at the final permitted decision, after using the same number of submissions as their C3 matches. Thus the truthful contradiction did not shorten the search on either predeclared measure in this pilot. Repetition across three seeds within each of only two authored families does not establish determinism or yield a meaningful task-population confidence interval.</w:t>
       </w:r>
     </w:p>
     <w:p>
@@ -2412,19 +2412,19 @@
     <w:p>
       <w:pPr/>
       <w:r>
-        <w:t>Internal and statistical validity. Five historical families supply only five independent clusters for factor comparisons, with one run per arm. Guidance blocks were not fully time balanced. The main tasks were chosen for a bounded overnight profile, not sampled randomly from the 20 family catalog. The earlier preregistered 20 family, repeated run GEE cannot be estimated appropriately here. Percentile resampling of five selected families is a sensitivity display, not a confirmatory uncertainty statement. The corrected pilot has three seeds per cell but only two authored families; its zero within-cell submission variance and single selected fork provide no general confidence interval. Action counts, candidate pairs, failed checks, and seeds within families are nested; they are never independent family replicates. No multiple comparison claims are made.</w:t>
+        <w:t>Internal and statistical validity. Five historical families supply only five independent clusters for factor comparisons, with one run per arm. Guidance blocks were not fully time balanced. The main tasks were chosen for a bounded overnight profile, not sampled randomly from the 20 family catalog. The earlier planned 20-family repeated-run hypothesis tests remain unresolved. The corrected pilot has three seeds per cell but only two authored families, and its single selected fork provides no general confidence interval. Action counts, candidate pairs, failed checks, and seeds within families are nested; they are never independent family replicates. No multiple comparison claims are made.</w:t>
       </w:r>
     </w:p>
     <w:p>
       <w:pPr/>
       <w:r>
-        <w:t>Measurement validity. Fourteen of 77 historical logged source strings are unparseable: 11 from an unquoted redaction token, two from ;def syntax, and one from an unmatched brace. Two final source hashes disagree with executed source hashes, both with redaction markers. None of the 81 historical per-action check records carries the raw evaluator result, so test–gate discordance cannot be localized within a trajectory. Auxiliary Docker logs do not constitute a complete, uniquely linked action archive and are not substituted for missing receipts. The original claim parser marked 40/40 main claims unknown because of uncleaned tag placement. The conservative correction leaves five unknown and cannot recover intent from implicit prose. AGENT_SELF_TERMINATION does not always mean voluntary evidence based stopping. Runtime and token accounting may omit or duplicate internal protocol reminder calls; token totals are not analyzed. API inventory and AST differences lack an independently coded strategy label; no inter rater reliability is available.</w:t>
+        <w:t>Measurement validity. Fourteen of 77 historical logged source strings are unparseable as saved: 11 from an unquoted redaction token, two from ;def syntax, and one from an unmatched brace. A quoted placeholder makes the 11 marked strings parse but does not reveal the erased expressions. Two final source hashes disagree with executed source hashes, both with redaction markers. None of the 81 historical per-action check records carries the raw evaluator result, so test–gate discordance cannot be localized within a trajectory. Auxiliary Docker logs do not constitute a complete, uniquely linked action archive and are not substituted for missing receipts. The original claim parser marked 40/40 main claims unknown because of uncleaned tag placement. The conservative correction leaves five unknown and cannot recover intent from implicit prose. Four stop records overran the nominal deadline, and one timeout label followed a late terminate call; runner labels cannot isolate voluntary agent stopping. Runtime and token accounting may omit or duplicate internal protocol reminder calls; token totals are not analyzed. API inventory and AST differences lack an independently coded strategy label; no inter rater reliability is available.</w:t>
       </w:r>
     </w:p>
     <w:p>
       <w:pPr/>
       <w:r>
-        <w:t>External and reproducibility validity. The historical model tag and prompt are recorded, but exact Ollama binary and model weights digests were not frozen in the main manifest; the later pilot records a weights digest and runtime version. The synthetic, short Python fixtures differ from mature cryptographic libraries and real web services. The pilot's stateless finite modes exclude memoryful or arbitrary programs, and independent human review of its task semantics is pending. The current research branch tracks the raw trajectories and archives needed to recalculate the reported counts; a reader must use a revision containing those files, because the default branch may lag this draft. Saved SHA 256 receipts and current code validate consistency and version linkage, not secure append only storage or a full third party reproduction. Historical engineering smokes and containment simulations have different protocols and remain outside the main estimates.</w:t>
+        <w:t>External and reproducibility validity. The historical model tag and prompt are recorded, but exact Ollama binary and model weights digests were not frozen in the main manifest; the later pilot records a weights digest and runtime version. The synthetic, short Python fixtures differ from mature cryptographic libraries and real web services. The pilot's stateless finite modes exclude memoryful or arbitrary programs, and independent human review of its task semantics is pending. The public repository's data revision 37074c198237ade67eb76921333b2835d329c863 contains the raw trajectories and archives needed to recalculate the reported counts; a partial export without those inputs cannot. Saved SHA 256 receipts and current code validate consistency and version linkage, not secure append only storage or a full third party reproduction. Historical engineering smokes and containment simulations have different protocols and remain outside the main estimates.</w:t>
       </w:r>
     </w:p>
     <w:p>
@@ -2444,7 +2444,7 @@
     <w:p>
       <w:pPr/>
       <w:r>
-        <w:t>The tracked full trajectories include model generated code, local path metadata, and tool output. Their presence in the research branch does not establish suitability as a journal supplement or a privacy-reviewed dataset; any transformed supplement must preserve the source/verifier linkage. The saved archives remain necessary to reproduce the counts. We know of no human participants in these episodes. Ethics approval or journal data-release clearance is not asserted because no such approval record was found in the reviewed repository.</w:t>
+        <w:t>The publicly tracked full trajectories include model generated code, local path metadata, and tool output. Their GitHub availability does not establish suitability as a journal supplement or a privacy-reviewed dataset; any transformed supplement must preserve the source/verifier linkage. The saved archives remain necessary to reproduce the counts. We know of no human participants in these episodes. Ethics approval or journal data-release clearance is not asserted because no such approval record was found in the reviewed repository.</w:t>
       </w:r>
     </w:p>
     <w:p>
@@ -2472,7 +2472,7 @@
     <w:p>
       <w:pPr/>
       <w:r>
-        <w:t>From the repository root, run python3 -B -m analysis.paper_pipeline --output paper/artifacts; this reads the saved historical main and AEAD pilot trajectories and verifies their hashes without launching Docker or the model. Separately run python3 -B -m analysis.audit_v7_decisive_excluded_pilot --check and python3 -B -m analysis.audit_v7_decisive_c5_fork --check to recheck the corrected-oracle pilot and matched continuation. Those commands require the v7 archives tracked on the current research branch; the derived audit JSON files alone do not reproduce their counts. Rebuild the figures and submission documents with sh reproduction/render_paper.sh using the bundled workspace Python dependencies described in paper/README.md. A checkout lacking experiments/runs/ or experiments/raw_archive/ can inspect the manuscript and derived tables but cannot independently regenerate all counts. The original study source commit is 98a4dcf414672c1725e4acdb9f08045370aa7f64; this manuscript and post-collection analysis remain an author-review draft pending a final source revision and journal data-availability statement.</w:t>
+        <w:t>From the repository root, run python3 -B -m analysis.paper_pipeline --output paper/artifacts; this reads the saved historical main and AEAD pilot trajectories and verifies their hashes without launching Docker or the model. Separately run python3 -B -m analysis.audit_v7_decisive_excluded_pilot --check and python3 -B -m analysis.audit_v7_decisive_c5_fork --check to recheck the corrected-oracle pilot and matched continuation. Those commands require the v7 archives tracked in the public repository; the derived audit JSON files alone do not reproduce their counts. Rebuild the figures and submission documents with sh reproduction/render_paper.sh using the bundled workspace Python dependencies described in paper/README.md. A checkout lacking experiments/runs/ or experiments/raw_archive/ can inspect the manuscript and derived tables but cannot independently regenerate all counts. The original study source commit is 98a4dcf414672c1725e4acdb9f08045370aa7f64; this manuscript and post-collection analysis remain an author-review draft pending a final manuscript revision and journal data-availability statement.</w:t>
       </w:r>
     </w:p>
     <w:p>

</xml_diff>

<commit_message>
Prepare exploratory paper and relocate saved-data audits
</commit_message>
<xml_diff>
--- a/paper/submission/full_paper.docx
+++ b/paper/submission/full_paper.docx
@@ -2512,7 +2512,7 @@
     <w:p>
       <w:pPr/>
       <w:r>
-        <w:t>[3] N. Shinn et al., “Reflexion: Language Agents with Verbal Reinforcement Learning,” NeurIPS, 2023. Primary source (https://arxiv.org/abs/2303.11366).</w:t>
+        <w:t>[3] N. Shinn, F. Cassano, A. Gopinath, K. Narasimhan, and S. Yao, “Reflexion: Language Agents with Verbal Reinforcement Learning,” NeurIPS, 2023. DOI: 10.52202/075280-0377 (https://doi.org/10.52202/075280-0377). Primary source (https://papers.nips.cc/paper_files/paper/2023/hash/1b44b878bb782e6954cd888628510e90-Abstract-Conference.html).</w:t>
       </w:r>
     </w:p>
     <w:p>
@@ -2536,7 +2536,7 @@
     <w:p>
       <w:pPr/>
       <w:r>
-        <w:t>[7] U. Kulsum et al., “A Case Study of LLM for Automated Vulnerability Repair: Assessing Impact of Reasoning and Patch Validation Feedback,” AIware, 2024. Primary source (https://arxiv.org/abs/2405.15690).</w:t>
+        <w:t>[7] U. Kulsum et al., “A Case Study of LLM for Automated Vulnerability Repair: Assessing Impact of Reasoning and Patch Validation Feedback,” AIware, 2024. DOI: 10.1145/3664646.3664770 (https://doi.org/10.1145/3664646.3664770). Primary source (https://2024.aiwareconf.org/details/aiware-2024-papers/14/A-Case-Study-of-LLM-for-Automated-Vulnerability-Repair-Assessing-Impact-of-Reasoning).</w:t>
       </w:r>
     </w:p>
     <w:p>
@@ -2548,7 +2548,7 @@
     <w:p>
       <w:pPr/>
       <w:r>
-        <w:t>[9] X. Liu et al., “AgentAbstain: Do LLM Agents Know When Not to Act?,” arXiv preprint, 2026. Primary source (https://arxiv.org/abs/2607.10059).</w:t>
+        <w:t>[9] X. Liu et al., “AgentAbstain: Do LLM Agents Know When Not to Act?,” NeurIPS (accepted, Evaluations &amp; Datasets Track), 2026. Primary source (https://agentabstain.github.io/).</w:t>
       </w:r>
     </w:p>
     <w:p>
@@ -2566,7 +2566,7 @@
     <w:p>
       <w:pPr/>
       <w:r>
-        <w:t>[12] R. Kamoi et al., “When Can LLMs Actually Correct Their Own Mistakes? A Critical Survey of Self-Correction of LLMs,” Transactions of the Association for Computational Linguistics, vol. 12, pp. 1417–1440, 2024. DOI: 10.1162/tacl_a_00713. Primary source (https://aclanthology.org/2024.tacl-1.78/).</w:t>
+        <w:t>[12] R. Kamoi et al., “When Can LLMs Actually Correct Their Own Mistakes? A Critical Survey of Self-Correction of LLMs,” Transactions of the Association for Computational Linguistics, vol. 12, pp. 1417–1440, 2024. DOI: 10.1162/tacl_a_00713 (https://doi.org/10.1162/tacl_a_00713). Primary source (https://aclanthology.org/2024.tacl-1.78/).</w:t>
       </w:r>
     </w:p>
     <w:p>
@@ -2584,7 +2584,7 @@
     <w:p>
       <w:pPr/>
       <w:r>
-        <w:t>[15] Z. Liu et al., “Do LLMs Catch Their Own Mistakes? A Comprehensive Benchmark for Reflective Tool Use LLMs,” Findings of ACL, 2026. DOI: 10.18653/v1/2026.findings-acl.86. Primary source (https://aclanthology.org/2026.findings-acl.86/).</w:t>
+        <w:t>[15] Z. Liu et al., “Do LLMs Catch Their Own Mistakes? A Comprehensive Benchmark for Reflective Tool Use LLMs,” Findings of ACL, 2026. DOI: 10.18653/v1/2026.findings-acl.86 (https://doi.org/10.18653/v1/2026.findings-acl.86). Primary source (https://aclanthology.org/2026.findings-acl.86/).</w:t>
       </w:r>
     </w:p>
     <w:p>
@@ -2602,7 +2602,7 @@
     <w:p>
       <w:pPr/>
       <w:r>
-        <w:t>[18] Z. Wang et al., “CyberGym: Evaluating AI Agents' Real-World Cybersecurity Capabilities at Scale,” arXiv preprint, 2025. Primary source (https://arxiv.org/abs/2506.02548).</w:t>
+        <w:t>[18] Z. Wang et al., “CyberGym: Evaluating AI Agents' Real-World Cybersecurity Capabilities at Scale,” ICLR, 2026. Primary source (https://www.cybergym.io/cybergym/).</w:t>
       </w:r>
     </w:p>
     <w:p>
@@ -2614,13 +2614,13 @@
     <w:p>
       <w:pPr/>
       <w:r>
-        <w:t>[20] M. Dworkin, “Recommendation for Block Cipher Modes of Operation: Galois/Counter Mode (GCM) and GMAC,” NIST SP 800-38D, 2007. Primary source (https://csrc.nist.gov/pubs/sp/800/38/d/final).</w:t>
+        <w:t>[20] M. Dworkin, “Recommendation for Block Cipher Modes of Operation: Galois/Counter Mode (GCM) and GMAC,” NIST SP 800-38D, 2007. DOI: 10.6028/NIST.SP.800-38D (https://doi.org/10.6028/NIST.SP.800-38D). Primary source (https://csrc.nist.gov/pubs/sp/800/38/d/final).</w:t>
       </w:r>
     </w:p>
     <w:p>
       <w:pPr/>
       <w:r>
-        <w:t>[21] M. S. Turan, E. Barker, W. Burr, and L. Chen, “Recommendation for Password-Based Key Derivation: Part 1: Storage Applications,” NIST SP 800-132, 2010. Primary source (https://csrc.nist.gov/pubs/sp/800/132/final).</w:t>
+        <w:t>[21] M. S. Turan, E. Barker, W. Burr, and L. Chen, “Recommendation for Password-Based Key Derivation: Part 1: Storage Applications,” NIST SP 800-132, 2010. DOI: 10.6028/NIST.SP.800-132 (https://doi.org/10.6028/NIST.SP.800-132). Primary source (https://csrc.nist.gov/pubs/sp/800/132/final).</w:t>
       </w:r>
     </w:p>
     <w:p>

</xml_diff>

<commit_message>
Build excluded integrated study pilot and admission evidence
</commit_message>
<xml_diff>
--- a/paper/submission/full_paper.docx
+++ b/paper/submission/full_paper.docx
@@ -125,7 +125,7 @@
     <w:p>
       <w:pPr/>
       <w:r>
-        <w:t>Recovery and stopping are already explicit research objects. Hell or High Water tests whether agents find alternative paths after external failure [8], and ReflecTool Bench studies error recognition and correction during tool use [15]. AgentAbstain studies when to abstain before or during execution in paired executable tasks [9]; work on false success and evidence carrying termination compares a final claim with external state or recorded support [10, 11]. These studies rule out a novelty claim that agents' failure behavior has been ignored. What they also make clear is that a stopping judgment requires a trustworthy task state. Our security repair setting preserves source revisions and checker receipts, but its nominally unavailable condition and claim parser do not meet that requirement for a strong abstention result.</w:t>
+        <w:t>Recovery and stopping are already explicit research objects. Hell or High Water tests whether agents find alternative paths after external failure [8], and ReflecTool Bench studies error recognition and correction during tool use [15]. AgentAbstain studies when to abstain before or during execution in paired executable tasks [9]; work on false success and evidence carrying termination compares a final claim with external state or recorded support [10, 11]. FixedBench studies already-resolved coding tasks and reports unnecessary code changes, a related action-bias setting without false security-check verdicts [26]. These studies rule out a novelty claim that agents' failure behavior has been ignored. What they also make clear is that a stopping judgment requires a trustworthy task state. Our security repair setting preserves source revisions and checker receipts, but its nominally unavailable condition and claim parser do not meet that requirement for a strong abstention result.</w:t>
       </w:r>
     </w:p>
     <w:p>
@@ -145,7 +145,7 @@
     <w:p>
       <w:pPr/>
       <w:r>
-        <w:t>Evaluator defects are an established concern in coding-agent research. SWE-Bench+ identifies solution leakage and weak tests among examined SWE-bench successes [23]. PatchBench shows that proof-of-concept-only validation can overstate vulnerability-patching success when a patch suppresses a crash without fixing the root cause [24]. In a different agentic-security setting, Shaw audits an indirect-prompt-injection harness and finds payload-delivery, scoring, false-rejection, and trace-persistence defects [25]. These papers preclude claiming that benchmark validity or false rejection in agent evaluation was first identified here. Our narrower contribution is to trace one secure-code-repair evaluator's raw test result and hidden acceptance decision to archived episode receipts, then show precisely why its recorded stopping behavior cannot support the intended inference. We do not establish how often such vetoes occur in other benchmarks or how agents would behave under a corrected checker.</w:t>
+        <w:t>Evaluator defects are an established concern in coding-agent research. SWE-Bench+ identifies solution leakage and weak tests among examined SWE-bench successes [23]. PatchBench shows that proof-of-concept-only validation can overstate vulnerability-patching success when a patch suppresses a crash without fixing the root cause [24]. In a different agentic-security setting, Shaw audits an indirect-prompt-injection harness and finds payload-delivery, scoring, false-rejection, and trace-persistence defects [25]. A recent oracle-integrity audit shows that correcting evaluator state can substantially change measured benchmark success [27]. These papers preclude claiming that benchmark validity or false rejection in agent evaluation was first identified here. Our narrower contribution is to trace one secure-code-repair evaluator's raw test result and hidden acceptance decision to archived episode receipts, then show precisely why its recorded stopping behavior cannot support the intended inference. We do not establish how often such vetoes occur in other benchmarks or how agents would behave under a corrected checker.</w:t>
       </w:r>
     </w:p>
     <w:p>
@@ -2512,7 +2512,7 @@
     <w:p>
       <w:pPr/>
       <w:r>
-        <w:t>[3] N. Shinn, F. Cassano, A. Gopinath, K. Narasimhan, and S. Yao, “Reflexion: Language Agents with Verbal Reinforcement Learning,” NeurIPS, 2023. DOI: 10.52202/075280-0377 (https://doi.org/10.52202/075280-0377). Primary source (https://papers.nips.cc/paper_files/paper/2023/hash/1b44b878bb782e6954cd888628510e90-Abstract-Conference.html).</w:t>
+        <w:t>[3] N. Shinn, F. Cassano, E. Berman, A. Gopinath, K. Narasimhan, and S. Yao, “Reflexion: Language Agents with Verbal Reinforcement Learning,” NeurIPS, 2023. DOI: 10.52202/075280-0377 (https://doi.org/10.52202/075280-0377). Primary source (https://papers.nips.cc/paper_files/paper/2023/hash/1b44b878bb782e6954cd888628510e90-Abstract-Conference.html).</w:t>
       </w:r>
     </w:p>
     <w:p>
@@ -2645,6 +2645,18 @@
       <w:pPr/>
       <w:r>
         <w:t>[25] A. Shaw, “Silent Failures in Agentic Security Evaluation: A Validated Harness for Tool-Call Mediation Under Indirect Prompt Injection,” arXiv preprint, 2026. Primary source (https://arxiv.org/abs/2609.32691).</w:t>
+      </w:r>
+    </w:p>
+    <w:p>
+      <w:pPr/>
+      <w:r>
+        <w:t>[26] T. Gloaguen et al., “Coding Agents Don't Know When to Act,” arXiv preprint, 2026. Primary source (https://arxiv.org/abs/2605.07769).</w:t>
+      </w:r>
+    </w:p>
+    <w:p>
+      <w:pPr/>
+      <w:r>
+        <w:t>[27] J. Chen, “When Agent Evaluation Becomes Unreliable: An Empirical Study of Oracle Failures and Configuration-Dependent Measurement in an LLM Agent Benchmark,” arXiv preprint, 2026. Primary source (https://arxiv.org/abs/2610.16067).</w:t>
       </w:r>
     </w:p>
     <w:sectPr>

</xml_diff>

<commit_message>
Sharpen paper hook and propose independent verdict check
</commit_message>
<xml_diff>
--- a/paper/submission/full_paper.docx
+++ b/paper/submission/full_paper.docx
@@ -7,7 +7,7 @@
         <w:pStyle w:val="Title"/>
       </w:pPr>
       <w:r>
-        <w:t>When the Tests Pass but the Benchmark Says No: Auditing Agent Persistence in Security Repair</w:t>
+        <w:t>The Tests Passed. The Benchmark Said No: A Hidden Veto in AI Security Repair</w:t>
       </w:r>
     </w:p>
     <w:p>
@@ -39,7 +39,7 @@
     <w:p>
       <w:pPr/>
       <w:r>
-        <w:t>When should a coding agent stop trying to repair a security failure? That depends on whether the checker reports a fixable defect. We audited a local qwen3:4b study of small cryptographic and web programs: five families crossed nominal repairability, feedback detail, and fixed guidance in 40 main episodes. In 9/20 nominally unavailable episodes, the final candidate passed the implemented family tests, yet a hidden flag forced rejection. The agent submitted another candidate after visible failure in 24/28 main episodes. None of 81 per-action records preserves the raw test result, so the moment of test–gate disagreement cannot be located. Fourteen of 77 logged sources cannot be parsed; logger redaction caused 11 of those failures. Among 25 adjacent pairs with parseable source, 17 changed called API inventory, which does not establish a security strategy change. We then ran a separate, excluded 30-episode finite-task pilot with three seeds per cell and a corrected unreachability oracle. Truthful contradiction feedback did not reduce submissions relative to generic failure in six matched blocks. One selected secure-candidate continuation ended after one decision under truthful PASS but used three decisions and another submission under false FAIL. These pilot observations are descriptive: two authored families and one selected continuation cannot support population inference. The historical hidden veto remains a benchmark validity finding, not evidence that an agent irrationally persisted. Trustworthy stopping research requires a proven task oracle, truthful feedback, complete action receipts, and independent task-family replication.</w:t>
+        <w:t>In 9 of 20 runs labeled “unavailable,” an AI coding agent's final submission passed the benchmark's implemented tests, yet a hidden rule rejected it. We audited 40 completed repair episodes of a local qwen3:4b agent across five small cryptographic and web task families, crossed by nominal repairability, feedback detail, and fixed contextual guidance. The agent submitted another candidate after visible failure in 24 of 28 episodes with such feedback. But none of 81 per-action receipts preserves the underlying test result, so we cannot tell whether those revisions followed code that had already passed the tests. The nine final test–verdict disagreements expose a defect in what this benchmark measures; they do not prove that the code was generally secure or that the agent irrationally persisted. We also analyzed source changes and ran a separate, excluded 30-episode pilot with a bounded corrected oracle. Among 25 parseable adjacent source pairs, 17 changed called API inventory, a structural observation rather than evidence of a new security strategy. In the pilot, truthful impossibility feedback did not reduce submissions relative to generic failure in six matched blocks. One selected fork from the same agent-generated secure candidate ended after a truthful PASS but produced an oracle-insecure candidate after false FAIL. This single pilot pair is not a population estimate. To study stopping causally, future work needs independently validated task semantics, matched feedback interventions, complete action-level test receipts, and replication across families.</w:t>
       </w:r>
     </w:p>
     <w:p>
@@ -59,7 +59,7 @@
     <w:p>
       <w:pPr/>
       <w:r>
-        <w:t>How many attempts should a coding agent make after a security checker says no? Counting attempts is easy; deciding whether the agent should have stopped requires knowing what “no” means. In the completed study examined here, nine final candidates passed the family tests but received a public failure because an unrevealed flag vetoed acceptance. The resulting trace can resemble an agent refusing to give up, even though the reported feedback does not identify a code change that would succeed. A hidden veto makes apparent persistence an ambiguous measurement.</w:t>
+        <w:t>Nine of the twenty final submissions in runs labeled “unavailable” passed the benchmark's implemented family tests. Yet the benchmark said FAIL: a hidden flag vetoed acceptance. That is a problem for anyone trying to measure whether an AI coding agent knows when to stop. It does not establish that the code was secure in general, or that a passing raw test preceded any particular revision; the preserved per-action records do not contain those raw results. The benchmark's final label and its own finite test result diverged, making apparent persistence an ambiguous measurement.</w:t>
       </w:r>
     </w:p>
     <w:p>

</xml_diff>

<commit_message>
Clarify paper timing and figures; correct Reflexion authors
</commit_message>
<xml_diff>
--- a/paper/submission/full_paper.docx
+++ b/paper/submission/full_paper.docx
@@ -1537,7 +1537,7 @@
     <w:p>
       <w:pPr/>
       <w:r>
-        <w:t>The main stop log contains 38 AGENT_SELF_TERMINATION, one BUDGET_STOP, and one TIMEOUT. Four of 40 episodes crossed the nominal 900 second boundary before the logged stop: three carry a self-termination label, and the fourth (slot 22) carries TIMEOUT although an agent-authored terminate call appears at about 909.5 seconds. The runner recorded that timeout at about 911.7 seconds. Thus the labels summarize runtime bookkeeping, not a clean contrast between voluntary stopping and forced interruption. The median elapsed time is 647.4 seconds per main episode (range of actions: two to six). The R median is 431.9 seconds and the U median is 728.2 seconds; the different failure exposure and artificial U veto make this a descriptive time contrast. The single budget stop occurred in a U episode; the single timeout in an R episode. Figure 4 shows the recorded labels.</w:t>
+        <w:t>The main stop log contains 38 AGENT_SELF_TERMINATION, one BUDGET_STOP, and one TIMEOUT. Four of 40 episodes crossed the nominal 900 second boundary before the logged stop: three carry a self-termination label, and the fourth (slot 22) carries TIMEOUT although an agent-authored terminate call appears at about 909.5 seconds. The runner logged the STOP event at about 911.7 seconds and RUN_FINISHED at 913.4 seconds. Thus the labels summarize runtime bookkeeping, not a clean contrast between voluntary stopping and forced interruption. The median elapsed time is 647.4 seconds per main episode (range of actions: two to six). The R median is 431.9 seconds and the U median is 728.2 seconds; the different failure exposure and artificial U veto make this a descriptive time contrast. The single budget stop occurred in a U episode; the single timeout in an R episode. Figure 4 shows the recorded labels.</w:t>
       </w:r>
     </w:p>
     <w:p>
@@ -1685,7 +1685,7 @@
         <w:ind w:left="360"/>
       </w:pPr>
       <w:r>
-        <w:t>4. Key derivation, weak feedback, guidance off (slot 22). The agent received several failures, then a passing candidate on the fifth tool step; the episode terminated by timeout at 913.4 seconds. Thus source acceptance and normal completion disagree. The logged final source also fails the exact executed source hash check, so the public source text cannot support a perfect final replay.</w:t>
+        <w:t>4. Key derivation, weak feedback, guidance off (slot 22). The agent received several failures, then a passing candidate on the fifth tool step; the runner logged TIMEOUT and finished the episode at 913.4 seconds. Thus source acceptance and normal completion disagree. The logged final source also fails the exact executed source hash check, so the public source text cannot support a perfect final replay.</w:t>
       </w:r>
     </w:p>
     <w:p>
@@ -2512,7 +2512,7 @@
     <w:p>
       <w:pPr/>
       <w:r>
-        <w:t>[3] N. Shinn, F. Cassano, E. Berman, A. Gopinath, K. Narasimhan, and S. Yao, “Reflexion: Language Agents with Verbal Reinforcement Learning,” NeurIPS, 2023. DOI: 10.52202/075280-0377 (https://doi.org/10.52202/075280-0377). Primary source (https://papers.nips.cc/paper_files/paper/2023/hash/1b44b878bb782e6954cd888628510e90-Abstract-Conference.html).</w:t>
+        <w:t>[3] N. Shinn, F. Cassano, A. Gopinath, K. Narasimhan, and S. Yao, “Reflexion: Language Agents with Verbal Reinforcement Learning,” NeurIPS, 2023. DOI: 10.52202/075280-0377 (https://doi.org/10.52202/075280-0377). Primary source (https://papers.nips.cc/paper_files/paper/2023/hash/1b44b878bb782e6954cd888628510e90-Abstract-Conference.html).</w:t>
       </w:r>
     </w:p>
     <w:p>

</xml_diff>

<commit_message>
Clarify paper timing and figures; correct Reflexion authors (#12)
</commit_message>
<xml_diff>
--- a/paper/submission/full_paper.docx
+++ b/paper/submission/full_paper.docx
@@ -1537,7 +1537,7 @@
     <w:p>
       <w:pPr/>
       <w:r>
-        <w:t>The main stop log contains 38 AGENT_SELF_TERMINATION, one BUDGET_STOP, and one TIMEOUT. Four of 40 episodes crossed the nominal 900 second boundary before the logged stop: three carry a self-termination label, and the fourth (slot 22) carries TIMEOUT although an agent-authored terminate call appears at about 909.5 seconds. The runner recorded that timeout at about 911.7 seconds. Thus the labels summarize runtime bookkeeping, not a clean contrast between voluntary stopping and forced interruption. The median elapsed time is 647.4 seconds per main episode (range of actions: two to six). The R median is 431.9 seconds and the U median is 728.2 seconds; the different failure exposure and artificial U veto make this a descriptive time contrast. The single budget stop occurred in a U episode; the single timeout in an R episode. Figure 4 shows the recorded labels.</w:t>
+        <w:t>The main stop log contains 38 AGENT_SELF_TERMINATION, one BUDGET_STOP, and one TIMEOUT. Four of 40 episodes crossed the nominal 900 second boundary before the logged stop: three carry a self-termination label, and the fourth (slot 22) carries TIMEOUT although an agent-authored terminate call appears at about 909.5 seconds. The runner logged the STOP event at about 911.7 seconds and RUN_FINISHED at 913.4 seconds. Thus the labels summarize runtime bookkeeping, not a clean contrast between voluntary stopping and forced interruption. The median elapsed time is 647.4 seconds per main episode (range of actions: two to six). The R median is 431.9 seconds and the U median is 728.2 seconds; the different failure exposure and artificial U veto make this a descriptive time contrast. The single budget stop occurred in a U episode; the single timeout in an R episode. Figure 4 shows the recorded labels.</w:t>
       </w:r>
     </w:p>
     <w:p>
@@ -1685,7 +1685,7 @@
         <w:ind w:left="360"/>
       </w:pPr>
       <w:r>
-        <w:t>4. Key derivation, weak feedback, guidance off (slot 22). The agent received several failures, then a passing candidate on the fifth tool step; the episode terminated by timeout at 913.4 seconds. Thus source acceptance and normal completion disagree. The logged final source also fails the exact executed source hash check, so the public source text cannot support a perfect final replay.</w:t>
+        <w:t>4. Key derivation, weak feedback, guidance off (slot 22). The agent received several failures, then a passing candidate on the fifth tool step; the runner logged TIMEOUT and finished the episode at 913.4 seconds. Thus source acceptance and normal completion disagree. The logged final source also fails the exact executed source hash check, so the public source text cannot support a perfect final replay.</w:t>
       </w:r>
     </w:p>
     <w:p>
@@ -2512,7 +2512,7 @@
     <w:p>
       <w:pPr/>
       <w:r>
-        <w:t>[3] N. Shinn, F. Cassano, E. Berman, A. Gopinath, K. Narasimhan, and S. Yao, “Reflexion: Language Agents with Verbal Reinforcement Learning,” NeurIPS, 2023. DOI: 10.52202/075280-0377 (https://doi.org/10.52202/075280-0377). Primary source (https://papers.nips.cc/paper_files/paper/2023/hash/1b44b878bb782e6954cd888628510e90-Abstract-Conference.html).</w:t>
+        <w:t>[3] N. Shinn, F. Cassano, A. Gopinath, K. Narasimhan, and S. Yao, “Reflexion: Language Agents with Verbal Reinforcement Learning,” NeurIPS, 2023. DOI: 10.52202/075280-0377 (https://doi.org/10.52202/075280-0377). Primary source (https://papers.nips.cc/paper_files/paper/2023/hash/1b44b878bb782e6954cd888628510e90-Abstract-Conference.html).</w:t>
       </w:r>
     </w:p>
     <w:p>

</xml_diff>